<commit_message>
Add current lecturer titles to signoff checklist
New item under Names & Titles to confirm each lecturer's current
professional title (rank, department, affiliation) before building,
since these can be outdated.

https://claude.ai/code/session_01TR8krxQEesnbMxpsfG849L
</commit_message>
<xml_diff>
--- a/Template_Signoff_Checklist.docx
+++ b/Template_Signoff_Checklist.docx
@@ -548,6 +548,38 @@
           <w:sz w:val="22"/>
         </w:rPr>
         <w:t>, and preferred display form</w:t>
+      </w:r>
+    </w:p>
+    <w:p>
+      <w:pPr>
+        <w:spacing w:after="100"/>
+        <w:ind w:left="360"/>
+      </w:pPr>
+      <w:r>
+        <w:rPr>
+          <w:rFonts w:ascii="Arial" w:hAnsi="Arial"/>
+          <w:color w:val="2D2D2D"/>
+          <w:sz w:val="24"/>
+        </w:rPr>
+        <w:t xml:space="preserve">☐  </w:t>
+      </w:r>
+      <w:r>
+        <w:rPr>
+          <w:rFonts w:ascii="Arial" w:hAnsi="Arial"/>
+          <w:b/>
+          <w:color w:val="2D2D2D"/>
+          <w:sz w:val="22"/>
+        </w:rPr>
+        <w:t>Current professional titles for all lecturers</w:t>
+      </w:r>
+      <w:r>
+        <w:rPr>
+          <w:rFonts w:ascii="Arial" w:hAnsi="Arial"/>
+          <w:b w:val="0"/>
+          <w:color w:val="2D2D2D"/>
+          <w:sz w:val="22"/>
+        </w:rPr>
+        <w:t xml:space="preserve"> — confirmed and up to date (e.g., academic rank, department, affiliation)</w:t>
       </w:r>
     </w:p>
     <w:p>

</xml_diff>